<commit_message>
tarea1: professionalize deliverable document with full diagram descriptions and justifications
</commit_message>
<xml_diff>
--- a/tarea1-uml/tarea1-uml.docx
+++ b/tarea1-uml/tarea1-uml.docx
@@ -2,19 +2,28 @@
 <file path=word/document.xml><?xml version="1.0" encoding="utf-8"?>
 <w:document xmlns:w="http://schemas.openxmlformats.org/wordprocessingml/2006/main" xmlns:m="http://schemas.openxmlformats.org/officeDocument/2006/math" xmlns:r="http://schemas.openxmlformats.org/officeDocument/2006/relationships" xmlns:o="urn:schemas-microsoft-com:office:office" xmlns:v="urn:schemas-microsoft-com:vml" xmlns:w10="urn:schemas-microsoft-com:office:word" xmlns:a="http://schemas.openxmlformats.org/drawingml/2006/main" xmlns:pic="http://schemas.openxmlformats.org/drawingml/2006/picture" xmlns:wp="http://schemas.openxmlformats.org/drawingml/2006/wordprocessingDrawing">
   <w:body>
-    <w:bookmarkStart w:id="33" w:name="Xfc9d011088039e8bcfcdf3884cee1210f4ec018"/>
+    <w:bookmarkStart w:id="29" w:name="análisis-de-sistemas-ii-2026"/>
     <w:p>
       <w:pPr>
         <w:pStyle w:val="Heading1"/>
       </w:pPr>
       <w:r>
-        <w:t xml:space="preserve">Análisis de Sistemas II 2026 — Tarea 1: Diagramas UML por módulo</w:t>
+        <w:t xml:space="preserve">Análisis de Sistemas II — 2026</w:t>
+      </w:r>
+    </w:p>
+    <w:bookmarkStart w:id="10" w:name="tarea-1-diagramas-uml-por-módulo"/>
+    <w:p>
+      <w:pPr>
+        <w:pStyle w:val="Heading2"/>
+      </w:pPr>
+      <w:r>
+        <w:t xml:space="preserve">Tarea 1: Diagramas UML por módulo</w:t>
       </w:r>
     </w:p>
     <w:bookmarkStart w:id="9" w:name="portada"/>
     <w:p>
       <w:pPr>
-        <w:pStyle w:val="Heading2"/>
+        <w:pStyle w:val="Heading3"/>
       </w:pPr>
       <w:r>
         <w:t xml:space="preserve">Portada</w:t>
@@ -53,7 +62,7 @@
               <w:pStyle w:val="Compact"/>
             </w:pPr>
             <w:r>
-              <w:t xml:space="preserve">Valor</w:t>
+              <w:t xml:space="preserve">Descripción</w:t>
             </w:r>
           </w:p>
         </w:tc>
@@ -213,7 +222,7 @@
                 <w:b/>
                 <w:bCs/>
               </w:rPr>
-              <w:t xml:space="preserve">Repositorio</w:t>
+              <w:t xml:space="preserve">Repositorio evaluado</w:t>
             </w:r>
           </w:p>
         </w:tc>
@@ -272,7 +281,7 @@
                 <w:b/>
                 <w:bCs/>
               </w:rPr>
-              <w:t xml:space="preserve">Commit / etiqueta evaluada</w:t>
+              <w:t xml:space="preserve">Etiqueta evaluada</w:t>
             </w:r>
           </w:p>
         </w:tc>
@@ -291,38 +300,92 @@
           </w:p>
         </w:tc>
       </w:tr>
+      <w:tr>
+        <w:tc>
+          <w:tcPr/>
+          <w:p>
+            <w:pPr>
+              <w:pStyle w:val="Compact"/>
+            </w:pPr>
+            <w:r>
+              <w:rPr>
+                <w:b/>
+                <w:bCs/>
+              </w:rPr>
+              <w:t xml:space="preserve">Documentos entregables</w:t>
+            </w:r>
+          </w:p>
+        </w:tc>
+        <w:tc>
+          <w:tcPr/>
+          <w:p>
+            <w:pPr>
+              <w:pStyle w:val="Compact"/>
+            </w:pPr>
+            <w:r>
+              <w:rPr>
+                <w:rStyle w:val="VerbatimChar"/>
+              </w:rPr>
+              <w:t xml:space="preserve">tarea1-uml.pdf</w:t>
+            </w:r>
+            <w:r>
+              <w:t xml:space="preserve"> </w:t>
+            </w:r>
+            <w:r>
+              <w:t xml:space="preserve">y</w:t>
+            </w:r>
+            <w:r>
+              <w:t xml:space="preserve"> </w:t>
+            </w:r>
+            <w:r>
+              <w:rPr>
+                <w:rStyle w:val="VerbatimChar"/>
+              </w:rPr>
+              <w:t xml:space="preserve">tarea1-uml.docx</w:t>
+            </w:r>
+          </w:p>
+        </w:tc>
+      </w:tr>
     </w:tbl>
-    <w:bookmarkEnd w:id="9"/>
-    <w:bookmarkStart w:id="10" w:name="declaración-de-datos"/>
-    <w:p>
-      <w:pPr>
-        <w:pStyle w:val="Heading2"/>
-      </w:pPr>
-      <w:r>
-        <w:t xml:space="preserve">Declaración de datos</w:t>
-      </w:r>
-    </w:p>
-    <w:p>
-      <w:pPr>
-        <w:pStyle w:val="FirstParagraph"/>
-      </w:pPr>
-      <w:r>
-        <w:t xml:space="preserve">Todos los datos, nombres de pacientes y resultados usados en este documento son</w:t>
-      </w:r>
-      <w:r>
-        <w:t xml:space="preserve"> </w:t>
-      </w:r>
+    <w:p>
+      <w:pPr>
+        <w:pStyle w:val="BodyText"/>
+      </w:pPr>
       <w:r>
         <w:rPr>
           <w:b/>
           <w:bCs/>
         </w:rPr>
+        <w:t xml:space="preserve">Declaración de datos.</w:t>
+      </w:r>
+      <w:r>
+        <w:t xml:space="preserve"> </w:t>
+      </w:r>
+      <w:r>
+        <w:t xml:space="preserve">Todos los datos, nombres de pacientes, valores y resultados empleados en este documento y en los diagramas son</w:t>
+      </w:r>
+      <w:r>
+        <w:t xml:space="preserve"> </w:t>
+      </w:r>
+      <w:r>
+        <w:rPr>
+          <w:b/>
+          <w:bCs/>
+        </w:rPr>
         <w:t xml:space="preserve">ficticios</w:t>
       </w:r>
       <w:r>
         <w:t xml:space="preserve">. No se incluye información clínica identificable real.</w:t>
       </w:r>
     </w:p>
+    <w:p>
+      <w:r>
+        <w:pict>
+          <v:rect style="width:0;height:1.5pt" o:hralign="center" o:hrstd="t" o:hr="t"/>
+        </w:pict>
+      </w:r>
+    </w:p>
+    <w:bookmarkEnd w:id="9"/>
     <w:bookmarkEnd w:id="10"/>
     <w:bookmarkStart w:id="11" w:name="índice"/>
     <w:p>
@@ -405,6 +468,13 @@
         <w:t xml:space="preserve">Bibliografía</w:t>
       </w:r>
     </w:p>
+    <w:p>
+      <w:r>
+        <w:pict>
+          <v:rect style="width:0;height:1.5pt" o:hralign="center" o:hrstd="t" o:hr="t"/>
+        </w:pict>
+      </w:r>
+    </w:p>
     <w:bookmarkEnd w:id="11"/>
     <w:bookmarkStart w:id="12" w:name="introducción"/>
     <w:p>
@@ -420,7 +490,7 @@
         <w:pStyle w:val="FirstParagraph"/>
       </w:pPr>
       <w:r>
-        <w:t xml:space="preserve">La presente tarea corresponde al módulo</w:t>
+        <w:t xml:space="preserve">El módulo</w:t>
       </w:r>
       <w:r>
         <w:t xml:space="preserve"> </w:t>
@@ -436,7 +506,7 @@
         <w:t xml:space="preserve"> </w:t>
       </w:r>
       <w:r>
-        <w:t xml:space="preserve">del sistema hospitalario integrado. El objetivo es modelar el proceso de negocio</w:t>
+        <w:t xml:space="preserve">del sistema hospitalario integrado controla el punto de control de calidad del laboratorio clínico: ningún resultado puede quedar disponible para el médico hasta ser revisado y</w:t>
       </w:r>
       <w:r>
         <w:t xml:space="preserve"> </w:t>
@@ -446,21 +516,13 @@
           <w:b/>
           <w:bCs/>
         </w:rPr>
-        <w:t xml:space="preserve">«revisión, validación o rechazo de un resultado por bioquímico»</w:t>
-      </w:r>
-      <w:r>
-        <w:t xml:space="preserve"> </w:t>
-      </w:r>
-      <w:r>
-        <w:t xml:space="preserve">mediante tres perspectivas complementarias de UML: el diagrama de casos de uso, el diagrama de actividad y el diagrama de secuencia.</w:t>
-      </w:r>
-    </w:p>
-    <w:p>
-      <w:pPr>
-        <w:pStyle w:val="BodyText"/>
-      </w:pPr>
-      <w:r>
-        <w:t xml:space="preserve">El proceso modelado se enmarca en el flujo de laboratorio clínico: un técnico ingresa resultados de pruebas pendientes, y un bioquímico es el responsable de revisar cada resultado contra los rangos de referencia antes de que quede disponible para el médico en el expediente electrónico (EMR). Durante esa revisión el resultado puede ser</w:t>
+        <w:t xml:space="preserve">validado</w:t>
+      </w:r>
+      <w:r>
+        <w:t xml:space="preserve"> </w:t>
+      </w:r>
+      <w:r>
+        <w:t xml:space="preserve">por un bioquímico. La presente tarea modela ese proceso de negocio —«revisión, validación o rechazo de un resultado por bioquímico»— mediante tres perspectivas complementarias de UML:</w:t>
       </w:r>
       <w:r>
         <w:t xml:space="preserve"> </w:t>
@@ -470,25 +532,10 @@
           <w:b/>
           <w:bCs/>
         </w:rPr>
-        <w:t xml:space="preserve">validado</w:t>
-      </w:r>
-      <w:r>
-        <w:t xml:space="preserve"> </w:t>
-      </w:r>
-      <w:r>
-        <w:t xml:space="preserve">(queda</w:t>
-      </w:r>
-      <w:r>
-        <w:t xml:space="preserve"> </w:t>
-      </w:r>
-      <w:r>
-        <w:rPr>
-          <w:rStyle w:val="VerbatimChar"/>
-        </w:rPr>
-        <w:t xml:space="preserve">resultado_listo</w:t>
-      </w:r>
-      <w:r>
-        <w:t xml:space="preserve">) o</w:t>
+        <w:t xml:space="preserve">casos de uso</w:t>
+      </w:r>
+      <w:r>
+        <w:t xml:space="preserve">,</w:t>
       </w:r>
       <w:r>
         <w:t xml:space="preserve"> </w:t>
@@ -498,13 +545,13 @@
           <w:b/>
           <w:bCs/>
         </w:rPr>
-        <w:t xml:space="preserve">rechazado</w:t>
-      </w:r>
-      <w:r>
-        <w:t xml:space="preserve"> </w:t>
-      </w:r>
-      <w:r>
-        <w:t xml:space="preserve">con un motivo obligatorio, lo que dispara una corrección por parte del técnico y una posterior</w:t>
+        <w:t xml:space="preserve">actividad</w:t>
+      </w:r>
+      <w:r>
+        <w:t xml:space="preserve"> </w:t>
+      </w:r>
+      <w:r>
+        <w:t xml:space="preserve">y</w:t>
       </w:r>
       <w:r>
         <w:t xml:space="preserve"> </w:t>
@@ -514,10 +561,75 @@
           <w:b/>
           <w:bCs/>
         </w:rPr>
+        <w:t xml:space="preserve">secuencia</w:t>
+      </w:r>
+      <w:r>
+        <w:t xml:space="preserve">.</w:t>
+      </w:r>
+    </w:p>
+    <w:p>
+      <w:pPr>
+        <w:pStyle w:val="BodyText"/>
+      </w:pPr>
+      <w:r>
+        <w:t xml:space="preserve">El proceso inicia cuando un técnico de laboratorio ingresa resultados pendientes y le asocia una prueba con su rango de referencia. El bioquímico consulta la lista de pendientes, revisa cada valor, y decide</w:t>
+      </w:r>
+      <w:r>
+        <w:t xml:space="preserve"> </w:t>
+      </w:r>
+      <w:r>
+        <w:rPr>
+          <w:b/>
+          <w:bCs/>
+        </w:rPr>
+        <w:t xml:space="preserve">validarlo</w:t>
+      </w:r>
+      <w:r>
+        <w:t xml:space="preserve"> </w:t>
+      </w:r>
+      <w:r>
+        <w:t xml:space="preserve">(quedando</w:t>
+      </w:r>
+      <w:r>
+        <w:t xml:space="preserve"> </w:t>
+      </w:r>
+      <w:r>
+        <w:rPr>
+          <w:rStyle w:val="VerbatimChar"/>
+        </w:rPr>
+        <w:t xml:space="preserve">resultado_listo</w:t>
+      </w:r>
+      <w:r>
+        <w:t xml:space="preserve">) o</w:t>
+      </w:r>
+      <w:r>
+        <w:t xml:space="preserve"> </w:t>
+      </w:r>
+      <w:r>
+        <w:rPr>
+          <w:b/>
+          <w:bCs/>
+        </w:rPr>
+        <w:t xml:space="preserve">rechazarlo</w:t>
+      </w:r>
+      <w:r>
+        <w:t xml:space="preserve"> </w:t>
+      </w:r>
+      <w:r>
+        <w:t xml:space="preserve">indicando un motivo. Un rechazo genera una notificación al técnico, que corrige el resultado y lo vuelve a dejar pendiente para su</w:t>
+      </w:r>
+      <w:r>
+        <w:t xml:space="preserve"> </w:t>
+      </w:r>
+      <w:r>
+        <w:rPr>
+          <w:b/>
+          <w:bCs/>
+        </w:rPr>
         <w:t xml:space="preserve">revalidación</w:t>
       </w:r>
       <w:r>
-        <w:t xml:space="preserve">. Si el valor supera un umbral crítico, se genera una alerta crítica.</w:t>
+        <w:t xml:space="preserve">. Si el valor supera el umbral crítico, se genera una alerta crítica y se notifica al médico.</w:t>
       </w:r>
     </w:p>
     <w:p>
@@ -525,11 +637,18 @@
         <w:pStyle w:val="BodyText"/>
       </w:pPr>
       <w:r>
-        <w:t xml:space="preserve">Los tres diagramas comparten los mismos actores (Bioquímico, Técnico de Laboratorio, Médico y Sistema de Alertas), los mismos pasos, mensajes y excepciones, y mantienen trazabilidad entre sí a través de la matriz requisito → diagrama → elemento. Todos los datos utilizados son ficticios y no incluyen información clínica identificable.</w:t>
+        <w:t xml:space="preserve">Los tres diagramas comparten los mismos actores —Bioquímico, Técnico de Laboratorio, Médico y Sistema de Alertas—, los mismos pasos, mensajes y excepciones, y mantienen trazabilidad entre sí mediante la matriz requisito → diagrama → elemento (sección 2.4). Los datos son ficticios.</w:t>
+      </w:r>
+    </w:p>
+    <w:p>
+      <w:r>
+        <w:pict>
+          <v:rect style="width:0;height:1.5pt" o:hralign="center" o:hrstd="t" o:hr="t"/>
+        </w:pict>
       </w:r>
     </w:p>
     <w:bookmarkEnd w:id="12"/>
-    <w:bookmarkStart w:id="30" w:name="desarrollo"/>
+    <w:bookmarkStart w:id="26" w:name="desarrollo"/>
     <w:p>
       <w:pPr>
         <w:pStyle w:val="Heading2"/>
@@ -538,7 +657,7 @@
         <w:t xml:space="preserve">2. Desarrollo</w:t>
       </w:r>
     </w:p>
-    <w:bookmarkStart w:id="17" w:name="diagrama-de-casos-de-uso"/>
+    <w:bookmarkStart w:id="16" w:name="diagrama-de-casos-de-uso"/>
     <w:p>
       <w:pPr>
         <w:pStyle w:val="Heading3"/>
@@ -549,7 +668,7 @@
     </w:p>
     <w:p>
       <w:pPr>
-        <w:pStyle w:val="CaptionedFigure"/>
+        <w:pStyle w:val="FirstParagraph"/>
       </w:pPr>
       <w:r>
         <w:drawing>
@@ -593,13 +712,20 @@
           </wp:inline>
         </w:drawing>
       </w:r>
-    </w:p>
-    <w:p>
-      <w:pPr>
-        <w:pStyle w:val="ImageCaption"/>
-      </w:pPr>
-      <w:r>
-        <w:t xml:space="preserve">Diagrama de casos de uso</w:t>
+      <w:r>
+        <w:t xml:space="preserve"> </w:t>
+      </w:r>
+      <w:r>
+        <w:t xml:space="preserve">Fuente editable:</w:t>
+      </w:r>
+      <w:r>
+        <w:t xml:space="preserve"> </w:t>
+      </w:r>
+      <w:r>
+        <w:rPr>
+          <w:rStyle w:val="VerbatimChar"/>
+        </w:rPr>
+        <w:t xml:space="preserve">casos-de-uso.puml</w:t>
       </w:r>
     </w:p>
     <w:p>
@@ -607,22 +733,665 @@
         <w:pStyle w:val="BodyText"/>
       </w:pPr>
       <w:r>
-        <w:t xml:space="preserve">Fuente editable:</w:t>
-      </w:r>
-      <w:r>
-        <w:t xml:space="preserve"> </w:t>
-      </w:r>
-      <w:hyperlink r:id="rId16">
-        <w:r>
-          <w:rPr>
-            <w:rStyle w:val="VerbatimChar"/>
-          </w:rPr>
-          <w:t xml:space="preserve">casos-de-uso.puml</w:t>
-        </w:r>
-      </w:hyperlink>
-    </w:p>
-    <w:bookmarkEnd w:id="17"/>
-    <w:bookmarkStart w:id="22" w:name="diagrama-de-actividad"/>
+        <w:rPr>
+          <w:b/>
+          <w:bCs/>
+        </w:rPr>
+        <w:t xml:space="preserve">Actores y objetivo.</w:t>
+      </w:r>
+      <w:r>
+        <w:t xml:space="preserve"> </w:t>
+      </w:r>
+      <w:r>
+        <w:t xml:space="preserve">El actor principal es el</w:t>
+      </w:r>
+      <w:r>
+        <w:t xml:space="preserve"> </w:t>
+      </w:r>
+      <w:r>
+        <w:rPr>
+          <w:b/>
+          <w:bCs/>
+        </w:rPr>
+        <w:t xml:space="preserve">Bioquímico</w:t>
+      </w:r>
+      <w:r>
+        <w:t xml:space="preserve">, responsable de la revisión. Como actores secundarios intervienen el</w:t>
+      </w:r>
+      <w:r>
+        <w:t xml:space="preserve"> </w:t>
+      </w:r>
+      <w:r>
+        <w:rPr>
+          <w:b/>
+          <w:bCs/>
+        </w:rPr>
+        <w:t xml:space="preserve">Técnico de Laboratorio</w:t>
+      </w:r>
+      <w:r>
+        <w:t xml:space="preserve">, el</w:t>
+      </w:r>
+      <w:r>
+        <w:t xml:space="preserve"> </w:t>
+      </w:r>
+      <w:r>
+        <w:rPr>
+          <w:b/>
+          <w:bCs/>
+        </w:rPr>
+        <w:t xml:space="preserve">Médico</w:t>
+      </w:r>
+      <w:r>
+        <w:t xml:space="preserve"> </w:t>
+      </w:r>
+      <w:r>
+        <w:t xml:space="preserve">y el</w:t>
+      </w:r>
+      <w:r>
+        <w:t xml:space="preserve"> </w:t>
+      </w:r>
+      <w:r>
+        <w:rPr>
+          <w:b/>
+          <w:bCs/>
+        </w:rPr>
+        <w:t xml:space="preserve">Sistema de Alertas</w:t>
+      </w:r>
+      <w:r>
+        <w:t xml:space="preserve">.</w:t>
+      </w:r>
+    </w:p>
+    <w:p>
+      <w:pPr>
+        <w:pStyle w:val="BodyText"/>
+      </w:pPr>
+      <w:r>
+        <w:rPr>
+          <w:b/>
+          <w:bCs/>
+        </w:rPr>
+        <w:t xml:space="preserve">Casos de uso (CU) identificados:</w:t>
+      </w:r>
+    </w:p>
+    <w:tbl>
+      <w:tblPr>
+        <w:tblStyle w:val="Table"/>
+        <w:tblW w:type="pct" w:w="5000"/>
+        <w:tblLayout w:type="fixed"/>
+        <w:tblLook w:firstRow="1" w:lastRow="0" w:firstColumn="0" w:lastColumn="0" w:noHBand="0" w:noVBand="0" w:val="0020"/>
+      </w:tblPr>
+      <w:tblGrid>
+        <w:gridCol w:w="2640"/>
+        <w:gridCol w:w="2640"/>
+        <w:gridCol w:w="2640"/>
+      </w:tblGrid>
+      <w:tr>
+        <w:trPr>
+          <w:tblHeader w:val="on"/>
+        </w:trPr>
+        <w:tc>
+          <w:tcPr/>
+          <w:p>
+            <w:pPr>
+              <w:pStyle w:val="Compact"/>
+            </w:pPr>
+            <w:r>
+              <w:t xml:space="preserve">CU</w:t>
+            </w:r>
+          </w:p>
+        </w:tc>
+        <w:tc>
+          <w:tcPr/>
+          <w:p>
+            <w:pPr>
+              <w:pStyle w:val="Compact"/>
+            </w:pPr>
+            <w:r>
+              <w:t xml:space="preserve">Nombre</w:t>
+            </w:r>
+          </w:p>
+        </w:tc>
+        <w:tc>
+          <w:tcPr/>
+          <w:p>
+            <w:pPr>
+              <w:pStyle w:val="Compact"/>
+            </w:pPr>
+            <w:r>
+              <w:t xml:space="preserve">Relación</w:t>
+            </w:r>
+          </w:p>
+        </w:tc>
+      </w:tr>
+      <w:tr>
+        <w:tc>
+          <w:tcPr/>
+          <w:p>
+            <w:pPr>
+              <w:pStyle w:val="Compact"/>
+            </w:pPr>
+            <w:r>
+              <w:t xml:space="preserve">CU-01</w:t>
+            </w:r>
+          </w:p>
+        </w:tc>
+        <w:tc>
+          <w:tcPr/>
+          <w:p>
+            <w:pPr>
+              <w:pStyle w:val="Compact"/>
+            </w:pPr>
+            <w:r>
+              <w:t xml:space="preserve">Ver resultados pendientes de revisión</w:t>
+            </w:r>
+          </w:p>
+        </w:tc>
+        <w:tc>
+          <w:tcPr/>
+          <w:p>
+            <w:pPr>
+              <w:pStyle w:val="Compact"/>
+            </w:pPr>
+            <w:r>
+              <w:t xml:space="preserve">consulta inicial</w:t>
+            </w:r>
+          </w:p>
+        </w:tc>
+      </w:tr>
+      <w:tr>
+        <w:tc>
+          <w:tcPr/>
+          <w:p>
+            <w:pPr>
+              <w:pStyle w:val="Compact"/>
+            </w:pPr>
+            <w:r>
+              <w:t xml:space="preserve">CU-02</w:t>
+            </w:r>
+          </w:p>
+        </w:tc>
+        <w:tc>
+          <w:tcPr/>
+          <w:p>
+            <w:pPr>
+              <w:pStyle w:val="Compact"/>
+            </w:pPr>
+            <w:r>
+              <w:t xml:space="preserve">Ver detalle con rangos de referencia</w:t>
+            </w:r>
+          </w:p>
+        </w:tc>
+        <w:tc>
+          <w:tcPr/>
+          <w:p>
+            <w:pPr>
+              <w:pStyle w:val="Compact"/>
+            </w:pPr>
+            <w:r>
+              <w:rPr>
+                <w:rStyle w:val="VerbatimChar"/>
+              </w:rPr>
+              <w:t xml:space="preserve">include</w:t>
+            </w:r>
+            <w:r>
+              <w:t xml:space="preserve"> </w:t>
+            </w:r>
+            <w:r>
+              <w:t xml:space="preserve">de CU-03 y CU-04</w:t>
+            </w:r>
+          </w:p>
+        </w:tc>
+      </w:tr>
+      <w:tr>
+        <w:tc>
+          <w:tcPr/>
+          <w:p>
+            <w:pPr>
+              <w:pStyle w:val="Compact"/>
+            </w:pPr>
+            <w:r>
+              <w:t xml:space="preserve">CU-03</w:t>
+            </w:r>
+          </w:p>
+        </w:tc>
+        <w:tc>
+          <w:tcPr/>
+          <w:p>
+            <w:pPr>
+              <w:pStyle w:val="Compact"/>
+            </w:pPr>
+            <w:r>
+              <w:t xml:space="preserve">Validar resultado</w:t>
+            </w:r>
+          </w:p>
+        </w:tc>
+        <w:tc>
+          <w:tcPr/>
+          <w:p>
+            <w:pPr>
+              <w:pStyle w:val="Compact"/>
+            </w:pPr>
+            <w:r>
+              <w:t xml:space="preserve">núcleo del proceso</w:t>
+            </w:r>
+          </w:p>
+        </w:tc>
+      </w:tr>
+      <w:tr>
+        <w:tc>
+          <w:tcPr/>
+          <w:p>
+            <w:pPr>
+              <w:pStyle w:val="Compact"/>
+            </w:pPr>
+            <w:r>
+              <w:t xml:space="preserve">CU-04</w:t>
+            </w:r>
+          </w:p>
+        </w:tc>
+        <w:tc>
+          <w:tcPr/>
+          <w:p>
+            <w:pPr>
+              <w:pStyle w:val="Compact"/>
+            </w:pPr>
+            <w:r>
+              <w:t xml:space="preserve">Rechazar resultado (con motivo)</w:t>
+            </w:r>
+          </w:p>
+        </w:tc>
+        <w:tc>
+          <w:tcPr/>
+          <w:p>
+            <w:pPr>
+              <w:pStyle w:val="Compact"/>
+            </w:pPr>
+            <w:r>
+              <w:t xml:space="preserve">núcleo del proceso</w:t>
+            </w:r>
+          </w:p>
+        </w:tc>
+      </w:tr>
+      <w:tr>
+        <w:tc>
+          <w:tcPr/>
+          <w:p>
+            <w:pPr>
+              <w:pStyle w:val="Compact"/>
+            </w:pPr>
+            <w:r>
+              <w:t xml:space="preserve">CU-05</w:t>
+            </w:r>
+          </w:p>
+        </w:tc>
+        <w:tc>
+          <w:tcPr/>
+          <w:p>
+            <w:pPr>
+              <w:pStyle w:val="Compact"/>
+            </w:pPr>
+            <w:r>
+              <w:t xml:space="preserve">Confirmar valor crítico</w:t>
+            </w:r>
+          </w:p>
+        </w:tc>
+        <w:tc>
+          <w:tcPr/>
+          <w:p>
+            <w:pPr>
+              <w:pStyle w:val="Compact"/>
+            </w:pPr>
+            <w:r>
+              <w:rPr>
+                <w:rStyle w:val="VerbatimChar"/>
+              </w:rPr>
+              <w:t xml:space="preserve">extend</w:t>
+            </w:r>
+            <w:r>
+              <w:t xml:space="preserve"> </w:t>
+            </w:r>
+            <w:r>
+              <w:t xml:space="preserve">de CU-03</w:t>
+            </w:r>
+          </w:p>
+        </w:tc>
+      </w:tr>
+      <w:tr>
+        <w:tc>
+          <w:tcPr/>
+          <w:p>
+            <w:pPr>
+              <w:pStyle w:val="Compact"/>
+            </w:pPr>
+            <w:r>
+              <w:t xml:space="preserve">CU-06</w:t>
+            </w:r>
+          </w:p>
+        </w:tc>
+        <w:tc>
+          <w:tcPr/>
+          <w:p>
+            <w:pPr>
+              <w:pStyle w:val="Compact"/>
+            </w:pPr>
+            <w:r>
+              <w:t xml:space="preserve">Consultar historial de validaciones</w:t>
+            </w:r>
+          </w:p>
+        </w:tc>
+        <w:tc>
+          <w:tcPr/>
+          <w:p>
+            <w:pPr>
+              <w:pStyle w:val="Compact"/>
+            </w:pPr>
+            <w:r>
+              <w:t xml:space="preserve">—</w:t>
+            </w:r>
+          </w:p>
+        </w:tc>
+      </w:tr>
+      <w:tr>
+        <w:tc>
+          <w:tcPr/>
+          <w:p>
+            <w:pPr>
+              <w:pStyle w:val="Compact"/>
+            </w:pPr>
+            <w:r>
+              <w:t xml:space="preserve">CU-07</w:t>
+            </w:r>
+          </w:p>
+        </w:tc>
+        <w:tc>
+          <w:tcPr/>
+          <w:p>
+            <w:pPr>
+              <w:pStyle w:val="Compact"/>
+            </w:pPr>
+            <w:r>
+              <w:t xml:space="preserve">Revisar resultado corregido</w:t>
+            </w:r>
+          </w:p>
+        </w:tc>
+        <w:tc>
+          <w:tcPr/>
+          <w:p>
+            <w:pPr>
+              <w:pStyle w:val="Compact"/>
+            </w:pPr>
+            <w:r>
+              <w:t xml:space="preserve">—</w:t>
+            </w:r>
+          </w:p>
+        </w:tc>
+      </w:tr>
+      <w:tr>
+        <w:tc>
+          <w:tcPr/>
+          <w:p>
+            <w:pPr>
+              <w:pStyle w:val="Compact"/>
+            </w:pPr>
+            <w:r>
+              <w:t xml:space="preserve">CU-08</w:t>
+            </w:r>
+          </w:p>
+        </w:tc>
+        <w:tc>
+          <w:tcPr/>
+          <w:p>
+            <w:pPr>
+              <w:pStyle w:val="Compact"/>
+            </w:pPr>
+            <w:r>
+              <w:t xml:space="preserve">Revalidar resultado corregido</w:t>
+            </w:r>
+          </w:p>
+        </w:tc>
+        <w:tc>
+          <w:tcPr/>
+          <w:p>
+            <w:pPr>
+              <w:pStyle w:val="Compact"/>
+            </w:pPr>
+            <w:r>
+              <w:t xml:space="preserve">—</w:t>
+            </w:r>
+          </w:p>
+        </w:tc>
+      </w:tr>
+    </w:tbl>
+    <w:p>
+      <w:pPr>
+        <w:pStyle w:val="BodyText"/>
+      </w:pPr>
+      <w:r>
+        <w:rPr>
+          <w:b/>
+          <w:bCs/>
+        </w:rPr>
+        <w:t xml:space="preserve">Justificación de</w:t>
+      </w:r>
+      <w:r>
+        <w:rPr>
+          <w:b/>
+          <w:bCs/>
+        </w:rPr>
+        <w:t xml:space="preserve"> </w:t>
+      </w:r>
+      <w:r>
+        <w:rPr>
+          <w:rStyle w:val="VerbatimChar"/>
+          <w:b/>
+          <w:bCs/>
+        </w:rPr>
+        <w:t xml:space="preserve">include</w:t>
+      </w:r>
+      <w:r>
+        <w:rPr>
+          <w:b/>
+          <w:bCs/>
+        </w:rPr>
+        <w:t xml:space="preserve"> </w:t>
+      </w:r>
+      <w:r>
+        <w:rPr>
+          <w:b/>
+          <w:bCs/>
+        </w:rPr>
+        <w:t xml:space="preserve">y</w:t>
+      </w:r>
+      <w:r>
+        <w:rPr>
+          <w:b/>
+          <w:bCs/>
+        </w:rPr>
+        <w:t xml:space="preserve"> </w:t>
+      </w:r>
+      <w:r>
+        <w:rPr>
+          <w:rStyle w:val="VerbatimChar"/>
+          <w:b/>
+          <w:bCs/>
+        </w:rPr>
+        <w:t xml:space="preserve">extend</w:t>
+      </w:r>
+      <w:r>
+        <w:rPr>
+          <w:b/>
+          <w:bCs/>
+        </w:rPr>
+        <w:t xml:space="preserve">.</w:t>
+      </w:r>
+      <w:r>
+        <w:t xml:space="preserve"> </w:t>
+      </w:r>
+      <w:r>
+        <w:t xml:space="preserve">CU-03 y CU-04</w:t>
+      </w:r>
+      <w:r>
+        <w:t xml:space="preserve"> </w:t>
+      </w:r>
+      <w:r>
+        <w:rPr>
+          <w:b/>
+          <w:bCs/>
+        </w:rPr>
+        <w:t xml:space="preserve">siempre</w:t>
+      </w:r>
+      <w:r>
+        <w:t xml:space="preserve"> </w:t>
+      </w:r>
+      <w:r>
+        <w:t xml:space="preserve">requieren ver el detalle con rangos para poder decidir, por lo que</w:t>
+      </w:r>
+      <w:r>
+        <w:t xml:space="preserve"> </w:t>
+      </w:r>
+      <w:r>
+        <w:rPr>
+          <w:rStyle w:val="VerbatimChar"/>
+        </w:rPr>
+        <w:t xml:space="preserve">CU-03 ..&gt; CU-02 : include</w:t>
+      </w:r>
+      <w:r>
+        <w:t xml:space="preserve"> </w:t>
+      </w:r>
+      <w:r>
+        <w:t xml:space="preserve">y</w:t>
+      </w:r>
+      <w:r>
+        <w:t xml:space="preserve"> </w:t>
+      </w:r>
+      <w:r>
+        <w:rPr>
+          <w:rStyle w:val="VerbatimChar"/>
+        </w:rPr>
+        <w:t xml:space="preserve">CU-04 ..&gt; CU-02 : include</w:t>
+      </w:r>
+      <w:r>
+        <w:t xml:space="preserve"> </w:t>
+      </w:r>
+      <w:r>
+        <w:t xml:space="preserve">(relación obligatoria, no opcional). En cambio, CU-05</w:t>
+      </w:r>
+      <w:r>
+        <w:t xml:space="preserve"> </w:t>
+      </w:r>
+      <w:r>
+        <w:rPr>
+          <w:b/>
+          <w:bCs/>
+        </w:rPr>
+        <w:t xml:space="preserve">solo</w:t>
+      </w:r>
+      <w:r>
+        <w:t xml:space="preserve"> </w:t>
+      </w:r>
+      <w:r>
+        <w:t xml:space="preserve">actúa cuando el valor supera el umbral crítico (condicional), por lo que se modela con</w:t>
+      </w:r>
+      <w:r>
+        <w:t xml:space="preserve"> </w:t>
+      </w:r>
+      <w:r>
+        <w:rPr>
+          <w:rStyle w:val="VerbatimChar"/>
+        </w:rPr>
+        <w:t xml:space="preserve">extend</w:t>
+      </w:r>
+      <w:r>
+        <w:t xml:space="preserve">:</w:t>
+      </w:r>
+      <w:r>
+        <w:t xml:space="preserve"> </w:t>
+      </w:r>
+      <w:r>
+        <w:rPr>
+          <w:rStyle w:val="VerbatimChar"/>
+        </w:rPr>
+        <w:t xml:space="preserve">CU-05 ..&gt; CU-03 : extend</w:t>
+      </w:r>
+      <w:r>
+        <w:t xml:space="preserve">. Esto refleja correctamente la semántica UML:</w:t>
+      </w:r>
+      <w:r>
+        <w:t xml:space="preserve"> </w:t>
+      </w:r>
+      <w:r>
+        <w:rPr>
+          <w:rStyle w:val="VerbatimChar"/>
+        </w:rPr>
+        <w:t xml:space="preserve">include</w:t>
+      </w:r>
+      <w:r>
+        <w:t xml:space="preserve"> </w:t>
+      </w:r>
+      <w:r>
+        <w:t xml:space="preserve">= siempre,</w:t>
+      </w:r>
+      <w:r>
+        <w:t xml:space="preserve"> </w:t>
+      </w:r>
+      <w:r>
+        <w:rPr>
+          <w:rStyle w:val="VerbatimChar"/>
+        </w:rPr>
+        <w:t xml:space="preserve">extend</w:t>
+      </w:r>
+      <w:r>
+        <w:t xml:space="preserve"> </w:t>
+      </w:r>
+      <w:r>
+        <w:t xml:space="preserve">= condicional.</w:t>
+      </w:r>
+    </w:p>
+    <w:p>
+      <w:pPr>
+        <w:pStyle w:val="BodyText"/>
+      </w:pPr>
+      <w:r>
+        <w:rPr>
+          <w:b/>
+          <w:bCs/>
+        </w:rPr>
+        <w:t xml:space="preserve">Objetivo del actor.</w:t>
+      </w:r>
+      <w:r>
+        <w:t xml:space="preserve"> </w:t>
+      </w:r>
+      <w:r>
+        <w:t xml:space="preserve">El Bioquímico persigue reducir al máximo el resultado no validado en el EMR: garantizar que todo resultado accesible al médico cumple el control de calidad, registrando responsable (</w:t>
+      </w:r>
+      <w:r>
+        <w:rPr>
+          <w:rStyle w:val="VerbatimChar"/>
+        </w:rPr>
+        <w:t xml:space="preserve">validated_by</w:t>
+      </w:r>
+      <w:r>
+        <w:t xml:space="preserve">) y fecha (</w:t>
+      </w:r>
+      <w:r>
+        <w:rPr>
+          <w:rStyle w:val="VerbatimChar"/>
+        </w:rPr>
+        <w:t xml:space="preserve">validated_at</w:t>
+      </w:r>
+      <w:r>
+        <w:t xml:space="preserve">).</w:t>
+      </w:r>
+    </w:p>
+    <w:p>
+      <w:r>
+        <w:pict>
+          <v:rect style="width:0;height:1.5pt" o:hralign="center" o:hrstd="t" o:hr="t"/>
+        </w:pict>
+      </w:r>
+    </w:p>
+    <w:bookmarkEnd w:id="16"/>
+    <w:bookmarkStart w:id="20" w:name="diagrama-de-actividad"/>
     <w:p>
       <w:pPr>
         <w:pStyle w:val="Heading3"/>
@@ -633,25 +1402,25 @@
     </w:p>
     <w:p>
       <w:pPr>
-        <w:pStyle w:val="CaptionedFigure"/>
+        <w:pStyle w:val="FirstParagraph"/>
       </w:pPr>
       <w:r>
         <w:drawing>
           <wp:inline>
             <wp:extent cx="5334000" cy="14215451"/>
             <wp:effectExtent b="0" l="0" r="0" t="0"/>
-            <wp:docPr descr="Diagrama de actividad" title="" id="19" name="Picture"/>
+            <wp:docPr descr="Diagrama de actividad" title="" id="18" name="Picture"/>
             <a:graphic>
               <a:graphicData uri="http://schemas.openxmlformats.org/drawingml/2006/picture">
                 <pic:pic>
                   <pic:nvPicPr>
-                    <pic:cNvPr descr="./actividad.png" id="20" name="Picture"/>
+                    <pic:cNvPr descr="actividad.png" id="19" name="Picture"/>
                     <pic:cNvPicPr>
                       <a:picLocks noChangeArrowheads="1" noChangeAspect="1"/>
                     </pic:cNvPicPr>
                   </pic:nvPicPr>
                   <pic:blipFill>
-                    <a:blip r:embed="rId18"/>
+                    <a:blip r:embed="rId17"/>
                     <a:stretch>
                       <a:fillRect/>
                     </a:stretch>
@@ -677,13 +1446,20 @@
           </wp:inline>
         </w:drawing>
       </w:r>
-    </w:p>
-    <w:p>
-      <w:pPr>
-        <w:pStyle w:val="ImageCaption"/>
-      </w:pPr>
-      <w:r>
-        <w:t xml:space="preserve">Diagrama de actividad</w:t>
+      <w:r>
+        <w:t xml:space="preserve"> </w:t>
+      </w:r>
+      <w:r>
+        <w:t xml:space="preserve">Fuente editable:</w:t>
+      </w:r>
+      <w:r>
+        <w:t xml:space="preserve"> </w:t>
+      </w:r>
+      <w:r>
+        <w:rPr>
+          <w:rStyle w:val="VerbatimChar"/>
+        </w:rPr>
+        <w:t xml:space="preserve">actividad.puml</w:t>
       </w:r>
     </w:p>
     <w:p>
@@ -691,22 +1467,256 @@
         <w:pStyle w:val="BodyText"/>
       </w:pPr>
       <w:r>
-        <w:t xml:space="preserve">Fuente editable:</w:t>
-      </w:r>
-      <w:r>
-        <w:t xml:space="preserve"> </w:t>
-      </w:r>
-      <w:hyperlink r:id="rId21">
-        <w:r>
-          <w:rPr>
-            <w:rStyle w:val="VerbatimChar"/>
-          </w:rPr>
-          <w:t xml:space="preserve">actividad.puml</w:t>
-        </w:r>
-      </w:hyperlink>
-    </w:p>
-    <w:bookmarkEnd w:id="22"/>
-    <w:bookmarkStart w:id="27" w:name="diagrama-de-secuencia"/>
+        <w:rPr>
+          <w:b/>
+          <w:bCs/>
+        </w:rPr>
+        <w:t xml:space="preserve">Modelo con swimlanes</w:t>
+      </w:r>
+      <w:r>
+        <w:t xml:space="preserve"> </w:t>
+      </w:r>
+      <w:r>
+        <w:t xml:space="preserve">que asignan cada paso al actor responsable:</w:t>
+      </w:r>
+    </w:p>
+    <w:p>
+      <w:pPr>
+        <w:pStyle w:val="Compact"/>
+        <w:numPr>
+          <w:ilvl w:val="0"/>
+          <w:numId w:val="1002"/>
+        </w:numPr>
+      </w:pPr>
+      <w:r>
+        <w:rPr>
+          <w:b/>
+          <w:bCs/>
+        </w:rPr>
+        <w:t xml:space="preserve">Bioquímico</w:t>
+      </w:r>
+      <w:r>
+        <w:t xml:space="preserve">: consulta de pendientes, selección del resultado, revisión contra rangos, decisión validar/rechazar y confirmación de valor crítico.</w:t>
+      </w:r>
+    </w:p>
+    <w:p>
+      <w:pPr>
+        <w:pStyle w:val="Compact"/>
+        <w:numPr>
+          <w:ilvl w:val="0"/>
+          <w:numId w:val="1002"/>
+        </w:numPr>
+      </w:pPr>
+      <w:r>
+        <w:rPr>
+          <w:b/>
+          <w:bCs/>
+        </w:rPr>
+        <w:t xml:space="preserve">Sistema</w:t>
+      </w:r>
+      <w:r>
+        <w:t xml:space="preserve">: registro de la validación, actualización de estado a</w:t>
+      </w:r>
+      <w:r>
+        <w:t xml:space="preserve"> </w:t>
+      </w:r>
+      <w:r>
+        <w:rPr>
+          <w:rStyle w:val="VerbatimChar"/>
+        </w:rPr>
+        <w:t xml:space="preserve">resultado_listo</w:t>
+      </w:r>
+      <w:r>
+        <w:t xml:space="preserve">, registro del rechazo y notificación.</w:t>
+      </w:r>
+    </w:p>
+    <w:p>
+      <w:pPr>
+        <w:pStyle w:val="Compact"/>
+        <w:numPr>
+          <w:ilvl w:val="0"/>
+          <w:numId w:val="1002"/>
+        </w:numPr>
+      </w:pPr>
+      <w:r>
+        <w:rPr>
+          <w:b/>
+          <w:bCs/>
+        </w:rPr>
+        <w:t xml:space="preserve">Técnico de Laboratorio</w:t>
+      </w:r>
+      <w:r>
+        <w:t xml:space="preserve">: corrección del resultado y retorno a pendiente.</w:t>
+      </w:r>
+    </w:p>
+    <w:p>
+      <w:pPr>
+        <w:pStyle w:val="FirstParagraph"/>
+      </w:pPr>
+      <w:r>
+        <w:rPr>
+          <w:b/>
+          <w:bCs/>
+        </w:rPr>
+        <w:t xml:space="preserve">Decisiones (decisión nodos):</w:t>
+      </w:r>
+      <w:r>
+        <w:t xml:space="preserve"> </w:t>
+      </w:r>
+      <w:r>
+        <w:t xml:space="preserve">- ¿Existen resultados sin validar? → No: mensaje «sin resultados pendientes» y fin.</w:t>
+      </w:r>
+      <w:r>
+        <w:t xml:space="preserve"> </w:t>
+      </w:r>
+      <w:r>
+        <w:t xml:space="preserve">- ¿El valor supera el umbral crítico? → Sí: confirmación de criticalidad y generación de alerta.</w:t>
+      </w:r>
+      <w:r>
+        <w:t xml:space="preserve"> </w:t>
+      </w:r>
+      <w:r>
+        <w:t xml:space="preserve">- ¿Está fuera del rango (anormal)? → Sí: marca</w:t>
+      </w:r>
+      <w:r>
+        <w:t xml:space="preserve"> </w:t>
+      </w:r>
+      <w:r>
+        <w:rPr>
+          <w:rStyle w:val="VerbatimChar"/>
+        </w:rPr>
+        <w:t xml:space="preserve">is_anormal</w:t>
+      </w:r>
+      <w:r>
+        <w:t xml:space="preserve">.</w:t>
+      </w:r>
+      <w:r>
+        <w:t xml:space="preserve"> </w:t>
+      </w:r>
+      <w:r>
+        <w:t xml:space="preserve">- ¿Se aprueba el resultado? → Sí: validación. No: solicitud de motivo de rechazo.</w:t>
+      </w:r>
+      <w:r>
+        <w:t xml:space="preserve"> </w:t>
+      </w:r>
+      <w:r>
+        <w:t xml:space="preserve">- ¿Motivo proporcionado? → No:</w:t>
+      </w:r>
+      <w:r>
+        <w:t xml:space="preserve"> </w:t>
+      </w:r>
+      <w:r>
+        <w:rPr>
+          <w:b/>
+          <w:bCs/>
+        </w:rPr>
+        <w:t xml:space="preserve">excepción</w:t>
+      </w:r>
+      <w:r>
+        <w:t xml:space="preserve"> </w:t>
+      </w:r>
+      <w:r>
+        <w:t xml:space="preserve">motivo obligatorio.</w:t>
+      </w:r>
+    </w:p>
+    <w:p>
+      <w:pPr>
+        <w:pStyle w:val="BodyText"/>
+      </w:pPr>
+      <w:r>
+        <w:rPr>
+          <w:b/>
+          <w:bCs/>
+        </w:rPr>
+        <w:t xml:space="preserve">Excepciones (reglas de negocio):</w:t>
+      </w:r>
+      <w:r>
+        <w:t xml:space="preserve"> </w:t>
+      </w:r>
+      <w:r>
+        <w:t xml:space="preserve">-</w:t>
+      </w:r>
+      <w:r>
+        <w:t xml:space="preserve"> </w:t>
+      </w:r>
+      <w:r>
+        <w:rPr>
+          <w:b/>
+          <w:bCs/>
+        </w:rPr>
+        <w:t xml:space="preserve">Motivo de rechazo obligatorio</w:t>
+      </w:r>
+      <w:r>
+        <w:t xml:space="preserve">: sin motivo, el rechazo es inválido (</w:t>
+      </w:r>
+      <w:r>
+        <w:rPr>
+          <w:rStyle w:val="VerbatimChar"/>
+        </w:rPr>
+        <w:t xml:space="preserve">422</w:t>
+      </w:r>
+      <w:r>
+        <w:t xml:space="preserve">).</w:t>
+      </w:r>
+      <w:r>
+        <w:t xml:space="preserve"> </w:t>
+      </w:r>
+      <w:r>
+        <w:t xml:space="preserve">-</w:t>
+      </w:r>
+      <w:r>
+        <w:t xml:space="preserve"> </w:t>
+      </w:r>
+      <w:r>
+        <w:rPr>
+          <w:b/>
+          <w:bCs/>
+        </w:rPr>
+        <w:t xml:space="preserve">Valor crítico no se rechaza directamente</w:t>
+      </w:r>
+      <w:r>
+        <w:t xml:space="preserve">: un valor crítico debe escalarse mediante alerta; no puede ser descartado sin elevar.</w:t>
+      </w:r>
+    </w:p>
+    <w:p>
+      <w:pPr>
+        <w:pStyle w:val="BodyText"/>
+      </w:pPr>
+      <w:r>
+        <w:rPr>
+          <w:b/>
+          <w:bCs/>
+        </w:rPr>
+        <w:t xml:space="preserve">Ciclo de corrección.</w:t>
+      </w:r>
+      <w:r>
+        <w:t xml:space="preserve"> </w:t>
+      </w:r>
+      <w:r>
+        <w:t xml:space="preserve">El diagrama cierra el flujo: rechazo → corrección del técnico → retorno a pendiente → revalidación (CU-07/CU-08), mediante el bucle</w:t>
+      </w:r>
+      <w:r>
+        <w:t xml:space="preserve"> </w:t>
+      </w:r>
+      <w:r>
+        <w:rPr>
+          <w:rStyle w:val="VerbatimChar"/>
+        </w:rPr>
+        <w:t xml:space="preserve">repeat while (¿hay más resultados pendientes?)</w:t>
+      </w:r>
+      <w:r>
+        <w:t xml:space="preserve">.</w:t>
+      </w:r>
+    </w:p>
+    <w:p>
+      <w:r>
+        <w:pict>
+          <v:rect style="width:0;height:1.5pt" o:hralign="center" o:hrstd="t" o:hr="t"/>
+        </w:pict>
+      </w:r>
+    </w:p>
+    <w:bookmarkEnd w:id="20"/>
+    <w:bookmarkStart w:id="24" w:name="diagrama-de-secuencia"/>
     <w:p>
       <w:pPr>
         <w:pStyle w:val="Heading3"/>
@@ -717,25 +1727,25 @@
     </w:p>
     <w:p>
       <w:pPr>
-        <w:pStyle w:val="CaptionedFigure"/>
+        <w:pStyle w:val="FirstParagraph"/>
       </w:pPr>
       <w:r>
         <w:drawing>
           <wp:inline>
             <wp:extent cx="5334000" cy="9399118"/>
             <wp:effectExtent b="0" l="0" r="0" t="0"/>
-            <wp:docPr descr="Diagrama de secuencia" title="" id="24" name="Picture"/>
+            <wp:docPr descr="Diagrama de secuencia" title="" id="22" name="Picture"/>
             <a:graphic>
               <a:graphicData uri="http://schemas.openxmlformats.org/drawingml/2006/picture">
                 <pic:pic>
                   <pic:nvPicPr>
-                    <pic:cNvPr descr="./secuencia.png" id="25" name="Picture"/>
+                    <pic:cNvPr descr="secuencia.png" id="23" name="Picture"/>
                     <pic:cNvPicPr>
                       <a:picLocks noChangeArrowheads="1" noChangeAspect="1"/>
                     </pic:cNvPicPr>
                   </pic:nvPicPr>
                   <pic:blipFill>
-                    <a:blip r:embed="rId23"/>
+                    <a:blip r:embed="rId21"/>
                     <a:stretch>
                       <a:fillRect/>
                     </a:stretch>
@@ -761,107 +1771,420 @@
           </wp:inline>
         </w:drawing>
       </w:r>
-    </w:p>
-    <w:p>
-      <w:pPr>
-        <w:pStyle w:val="ImageCaption"/>
-      </w:pPr>
-      <w:r>
-        <w:t xml:space="preserve">Diagrama de secuencia</w:t>
+      <w:r>
+        <w:t xml:space="preserve"> </w:t>
+      </w:r>
+      <w:r>
+        <w:t xml:space="preserve">Fuente editable:</w:t>
+      </w:r>
+      <w:r>
+        <w:t xml:space="preserve"> </w:t>
+      </w:r>
+      <w:r>
+        <w:rPr>
+          <w:rStyle w:val="VerbatimChar"/>
+        </w:rPr>
+        <w:t xml:space="preserve">secuencia.puml</w:t>
       </w:r>
     </w:p>
     <w:p>
       <w:pPr>
         <w:pStyle w:val="BodyText"/>
       </w:pPr>
-      <w:r>
-        <w:t xml:space="preserve">Fuente editable:</w:t>
-      </w:r>
-      <w:r>
-        <w:t xml:space="preserve"> </w:t>
-      </w:r>
-      <w:hyperlink r:id="rId26">
-        <w:r>
-          <w:rPr>
-            <w:rStyle w:val="VerbatimChar"/>
-          </w:rPr>
-          <w:t xml:space="preserve">secuencia.puml</w:t>
-        </w:r>
-      </w:hyperlink>
-    </w:p>
-    <w:bookmarkEnd w:id="27"/>
-    <w:bookmarkStart w:id="29" w:name="matriz-de-trazabilidad"/>
-    <w:p>
-      <w:pPr>
-        <w:pStyle w:val="Heading3"/>
-      </w:pPr>
-      <w:r>
-        <w:t xml:space="preserve">2.4 Matriz de trazabilidad</w:t>
-      </w:r>
-    </w:p>
-    <w:p>
-      <w:pPr>
-        <w:pStyle w:val="FirstParagraph"/>
-      </w:pPr>
-      <w:r>
-        <w:t xml:space="preserve">Ver</w:t>
-      </w:r>
-      <w:r>
-        <w:t xml:space="preserve"> </w:t>
-      </w:r>
-      <w:hyperlink r:id="rId28">
-        <w:r>
-          <w:rPr>
-            <w:rStyle w:val="VerbatimChar"/>
-          </w:rPr>
-          <w:t xml:space="preserve">matriz-trazabilidad.md</w:t>
-        </w:r>
-      </w:hyperlink>
-      <w:r>
-        <w:t xml:space="preserve">.</w:t>
-      </w:r>
-    </w:p>
-    <w:bookmarkEnd w:id="29"/>
-    <w:bookmarkEnd w:id="30"/>
-    <w:bookmarkStart w:id="31" w:name="conclusión"/>
-    <w:p>
-      <w:pPr>
-        <w:pStyle w:val="Heading2"/>
-      </w:pPr>
-      <w:r>
-        <w:t xml:space="preserve">3. Conclusión</w:t>
-      </w:r>
-    </w:p>
-    <w:p>
-      <w:pPr>
-        <w:pStyle w:val="FirstParagraph"/>
-      </w:pPr>
-      <w:r>
-        <w:t xml:space="preserve">Se logró un modelado completo y trazable del proceso de validación de resultados por bioquímico. Los tres diagramas representan perspectivas complementarias y actuales: el de casos de uso delimita actores y objetivos (CU-01 a CU-08), el de actividad expresa decisiones, excepciones y reglas de negocio, y el de secuencia muestra participantes, mensajes HTTP y validaciones con sus respuestas.</w:t>
-      </w:r>
-    </w:p>
-    <w:p>
-      <w:pPr>
-        <w:pStyle w:val="BodyText"/>
-      </w:pPr>
-      <w:r>
-        <w:t xml:space="preserve">La decisión más relevante fue modelar la regla de negocio de que</w:t>
-      </w:r>
-      <w:r>
-        <w:t xml:space="preserve"> </w:t>
-      </w:r>
       <w:r>
         <w:rPr>
           <w:b/>
           <w:bCs/>
         </w:rPr>
-        <w:t xml:space="preserve">un valor crítico no puede rechazarse directamente</w:t>
-      </w:r>
-      <w:r>
-        <w:t xml:space="preserve"> </w:t>
-      </w:r>
-      <w:r>
-        <w:t xml:space="preserve">y debe escalarse mediante alerta. Esta regla condiciona la dirección del</w:t>
+        <w:t xml:space="preserve">Participantes:</w:t>
+      </w:r>
+      <w:r>
+        <w:t xml:space="preserve"> </w:t>
+      </w:r>
+      <w:r>
+        <w:t xml:space="preserve">Bioquímico, Técnico de Laboratorio, API del sistema, entidades LabResult, LabOrderItem y CriticalAlert, y el Médico.</w:t>
+      </w:r>
+    </w:p>
+    <w:p>
+      <w:pPr>
+        <w:pStyle w:val="BodyText"/>
+      </w:pPr>
+      <w:r>
+        <w:rPr>
+          <w:b/>
+          <w:bCs/>
+        </w:rPr>
+        <w:t xml:space="preserve">Mensajes HTTP y validaciones:</w:t>
+      </w:r>
+    </w:p>
+    <w:tbl>
+      <w:tblPr>
+        <w:tblStyle w:val="Table"/>
+        <w:tblW w:type="pct" w:w="5000"/>
+        <w:tblLayout w:type="fixed"/>
+        <w:tblLook w:firstRow="1" w:lastRow="0" w:firstColumn="0" w:lastColumn="0" w:noHBand="0" w:noVBand="0" w:val="0020"/>
+      </w:tblPr>
+      <w:tblGrid>
+        <w:gridCol w:w="2640"/>
+        <w:gridCol w:w="2640"/>
+        <w:gridCol w:w="2640"/>
+      </w:tblGrid>
+      <w:tr>
+        <w:trPr>
+          <w:tblHeader w:val="on"/>
+        </w:trPr>
+        <w:tc>
+          <w:tcPr/>
+          <w:p>
+            <w:pPr>
+              <w:pStyle w:val="Compact"/>
+            </w:pPr>
+            <w:r>
+              <w:rPr>
+                <w:b/>
+                <w:bCs/>
+              </w:rPr>
+              <w:t xml:space="preserve">CU</w:t>
+            </w:r>
+          </w:p>
+        </w:tc>
+        <w:tc>
+          <w:tcPr/>
+          <w:p>
+            <w:pPr>
+              <w:pStyle w:val="Compact"/>
+            </w:pPr>
+            <w:r>
+              <w:t xml:space="preserve">Mensaje</w:t>
+            </w:r>
+          </w:p>
+        </w:tc>
+        <w:tc>
+          <w:tcPr/>
+          <w:p>
+            <w:pPr>
+              <w:pStyle w:val="Compact"/>
+            </w:pPr>
+            <w:r>
+              <w:t xml:space="preserve">Comportamiento</w:t>
+            </w:r>
+          </w:p>
+        </w:tc>
+      </w:tr>
+      <w:tr>
+        <w:tc>
+          <w:tcPr/>
+          <w:p>
+            <w:pPr>
+              <w:pStyle w:val="Compact"/>
+            </w:pPr>
+            <w:r>
+              <w:t xml:space="preserve">CU-01/CU-02</w:t>
+            </w:r>
+          </w:p>
+        </w:tc>
+        <w:tc>
+          <w:tcPr/>
+          <w:p>
+            <w:pPr>
+              <w:pStyle w:val="Compact"/>
+            </w:pPr>
+            <w:r>
+              <w:rPr>
+                <w:rStyle w:val="VerbatimChar"/>
+              </w:rPr>
+              <w:t xml:space="preserve">GET</w:t>
+            </w:r>
+            <w:r>
+              <w:t xml:space="preserve"> </w:t>
+            </w:r>
+            <w:r>
+              <w:t xml:space="preserve">resultados pendientes</w:t>
+            </w:r>
+          </w:p>
+        </w:tc>
+        <w:tc>
+          <w:tcPr/>
+          <w:p>
+            <w:pPr>
+              <w:pStyle w:val="Compact"/>
+            </w:pPr>
+            <w:r>
+              <w:t xml:space="preserve">autenticación y permisos de la API;</w:t>
+            </w:r>
+            <w:r>
+              <w:t xml:space="preserve"> </w:t>
+            </w:r>
+            <w:r>
+              <w:rPr>
+                <w:rStyle w:val="VerbatimChar"/>
+              </w:rPr>
+              <w:t xml:space="preserve">403</w:t>
+            </w:r>
+            <w:r>
+              <w:t xml:space="preserve"> </w:t>
+            </w:r>
+            <w:r>
+              <w:t xml:space="preserve">sin rol</w:t>
+            </w:r>
+          </w:p>
+        </w:tc>
+      </w:tr>
+      <w:tr>
+        <w:tc>
+          <w:tcPr/>
+          <w:p>
+            <w:pPr>
+              <w:pStyle w:val="Compact"/>
+            </w:pPr>
+            <w:r>
+              <w:t xml:space="preserve">CU-03</w:t>
+            </w:r>
+          </w:p>
+        </w:tc>
+        <w:tc>
+          <w:tcPr/>
+          <w:p>
+            <w:pPr>
+              <w:pStyle w:val="Compact"/>
+            </w:pPr>
+            <w:r>
+              <w:rPr>
+                <w:rStyle w:val="VerbatimChar"/>
+              </w:rPr>
+              <w:t xml:space="preserve">POST …/validate</w:t>
+            </w:r>
+          </w:p>
+        </w:tc>
+        <w:tc>
+          <w:tcPr/>
+          <w:p>
+            <w:pPr>
+              <w:pStyle w:val="Compact"/>
+            </w:pPr>
+            <w:r>
+              <w:t xml:space="preserve">guarda</w:t>
+            </w:r>
+            <w:r>
+              <w:t xml:space="preserve"> </w:t>
+            </w:r>
+            <w:r>
+              <w:rPr>
+                <w:rStyle w:val="VerbatimChar"/>
+              </w:rPr>
+              <w:t xml:space="preserve">validated_by</w:t>
+            </w:r>
+            <w:r>
+              <w:t xml:space="preserve">,</w:t>
+            </w:r>
+            <w:r>
+              <w:t xml:space="preserve"> </w:t>
+            </w:r>
+            <w:r>
+              <w:rPr>
+                <w:rStyle w:val="VerbatimChar"/>
+              </w:rPr>
+              <w:t xml:space="preserve">validated_at</w:t>
+            </w:r>
+            <w:r>
+              <w:t xml:space="preserve">;</w:t>
+            </w:r>
+            <w:r>
+              <w:t xml:space="preserve"> </w:t>
+            </w:r>
+            <w:r>
+              <w:rPr>
+                <w:rStyle w:val="VerbatimChar"/>
+              </w:rPr>
+              <w:t xml:space="preserve">409</w:t>
+            </w:r>
+            <w:r>
+              <w:t xml:space="preserve"> </w:t>
+            </w:r>
+            <w:r>
+              <w:t xml:space="preserve">si ya validado</w:t>
+            </w:r>
+          </w:p>
+        </w:tc>
+      </w:tr>
+      <w:tr>
+        <w:tc>
+          <w:tcPr/>
+          <w:p>
+            <w:pPr>
+              <w:pStyle w:val="Compact"/>
+            </w:pPr>
+            <w:r>
+              <w:t xml:space="preserve">CU-05</w:t>
+            </w:r>
+          </w:p>
+        </w:tc>
+        <w:tc>
+          <w:tcPr/>
+          <w:p>
+            <w:pPr>
+              <w:pStyle w:val="Compact"/>
+            </w:pPr>
+            <w:r>
+              <w:t xml:space="preserve">crear</w:t>
+            </w:r>
+            <w:r>
+              <w:t xml:space="preserve"> </w:t>
+            </w:r>
+            <w:r>
+              <w:rPr>
+                <w:rStyle w:val="VerbatimChar"/>
+              </w:rPr>
+              <w:t xml:space="preserve">CriticalAlert</w:t>
+            </w:r>
+          </w:p>
+        </w:tc>
+        <w:tc>
+          <w:tcPr/>
+          <w:p>
+            <w:pPr>
+              <w:pStyle w:val="Compact"/>
+            </w:pPr>
+            <w:r>
+              <w:t xml:space="preserve">validación del umbral crítico; notificación al médico</w:t>
+            </w:r>
+          </w:p>
+        </w:tc>
+      </w:tr>
+      <w:tr>
+        <w:tc>
+          <w:tcPr/>
+          <w:p>
+            <w:pPr>
+              <w:pStyle w:val="Compact"/>
+            </w:pPr>
+            <w:r>
+              <w:t xml:space="preserve">CU-04</w:t>
+            </w:r>
+          </w:p>
+        </w:tc>
+        <w:tc>
+          <w:tcPr/>
+          <w:p>
+            <w:pPr>
+              <w:pStyle w:val="Compact"/>
+            </w:pPr>
+            <w:r>
+              <w:rPr>
+                <w:rStyle w:val="VerbatimChar"/>
+              </w:rPr>
+              <w:t xml:space="preserve">POST …/reject {motivo}</w:t>
+            </w:r>
+          </w:p>
+        </w:tc>
+        <w:tc>
+          <w:tcPr/>
+          <w:p>
+            <w:pPr>
+              <w:pStyle w:val="Compact"/>
+            </w:pPr>
+            <w:r>
+              <w:rPr>
+                <w:rStyle w:val="VerbatimChar"/>
+              </w:rPr>
+              <w:t xml:space="preserve">422</w:t>
+            </w:r>
+            <w:r>
+              <w:t xml:space="preserve"> </w:t>
+            </w:r>
+            <w:r>
+              <w:t xml:space="preserve">si motivo vacío (excepción)</w:t>
+            </w:r>
+          </w:p>
+        </w:tc>
+      </w:tr>
+      <w:tr>
+        <w:tc>
+          <w:tcPr/>
+          <w:p>
+            <w:pPr>
+              <w:pStyle w:val="Compact"/>
+            </w:pPr>
+            <w:r>
+              <w:t xml:space="preserve">CU-07</w:t>
+            </w:r>
+          </w:p>
+        </w:tc>
+        <w:tc>
+          <w:tcPr/>
+          <w:p>
+            <w:pPr>
+              <w:pStyle w:val="Compact"/>
+            </w:pPr>
+            <w:r>
+              <w:rPr>
+                <w:rStyle w:val="VerbatimChar"/>
+              </w:rPr>
+              <w:t xml:space="preserve">POST …/correct {nuevo valor}</w:t>
+            </w:r>
+          </w:p>
+        </w:tc>
+        <w:tc>
+          <w:tcPr/>
+          <w:p>
+            <w:pPr>
+              <w:pStyle w:val="Compact"/>
+            </w:pPr>
+            <w:r>
+              <w:t xml:space="preserve">validación de la corrección; retorno a pendiente</w:t>
+            </w:r>
+          </w:p>
+        </w:tc>
+      </w:tr>
+      <w:tr>
+        <w:tc>
+          <w:tcPr/>
+          <w:p>
+            <w:pPr>
+              <w:pStyle w:val="Compact"/>
+            </w:pPr>
+            <w:r>
+              <w:t xml:space="preserve">CU-08</w:t>
+            </w:r>
+          </w:p>
+        </w:tc>
+        <w:tc>
+          <w:tcPr/>
+          <w:p>
+            <w:pPr>
+              <w:pStyle w:val="Compact"/>
+            </w:pPr>
+            <w:r>
+              <w:rPr>
+                <w:rStyle w:val="VerbatimChar"/>
+              </w:rPr>
+              <w:t xml:space="preserve">POST …/validate</w:t>
+            </w:r>
+          </w:p>
+        </w:tc>
+        <w:tc>
+          <w:tcPr/>
+          <w:p>
+            <w:pPr>
+              <w:pStyle w:val="Compact"/>
+            </w:pPr>
+            <w:r>
+              <w:t xml:space="preserve">revalidación del resultado corregido</w:t>
+            </w:r>
+          </w:p>
+        </w:tc>
+      </w:tr>
+    </w:tbl>
+    <w:p>
+      <w:pPr>
+        <w:pStyle w:val="BodyText"/>
+      </w:pPr>
+      <w:r>
+        <w:rPr>
+          <w:b/>
+          <w:bCs/>
+        </w:rPr>
+        <w:t xml:space="preserve">Excepciones de la API:</w:t>
       </w:r>
       <w:r>
         <w:t xml:space="preserve"> </w:t>
@@ -870,13 +2193,546 @@
         <w:rPr>
           <w:rStyle w:val="VerbatimChar"/>
         </w:rPr>
+        <w:t xml:space="preserve">403</w:t>
+      </w:r>
+      <w:r>
+        <w:t xml:space="preserve"> </w:t>
+      </w:r>
+      <w:r>
+        <w:t xml:space="preserve">(permiso insuficiente),</w:t>
+      </w:r>
+      <w:r>
+        <w:t xml:space="preserve"> </w:t>
+      </w:r>
+      <w:r>
+        <w:rPr>
+          <w:rStyle w:val="VerbatimChar"/>
+        </w:rPr>
+        <w:t xml:space="preserve">409</w:t>
+      </w:r>
+      <w:r>
+        <w:t xml:space="preserve"> </w:t>
+      </w:r>
+      <w:r>
+        <w:t xml:space="preserve">(resultado ya validado) y</w:t>
+      </w:r>
+      <w:r>
+        <w:t xml:space="preserve"> </w:t>
+      </w:r>
+      <w:r>
+        <w:rPr>
+          <w:rStyle w:val="VerbatimChar"/>
+        </w:rPr>
+        <w:t xml:space="preserve">422</w:t>
+      </w:r>
+      <w:r>
+        <w:t xml:space="preserve"> </w:t>
+      </w:r>
+      <w:r>
+        <w:t xml:space="preserve">(motivo de rechazo faltante). El diagrama muestra participantes, mensajes, validaciones y su respuesta, que es el requisito del enunciado.</w:t>
+      </w:r>
+    </w:p>
+    <w:p>
+      <w:r>
+        <w:pict>
+          <v:rect style="width:0;height:1.5pt" o:hralign="center" o:hrstd="t" o:hr="t"/>
+        </w:pict>
+      </w:r>
+    </w:p>
+    <w:bookmarkEnd w:id="24"/>
+    <w:bookmarkStart w:id="25" w:name="X745174596cf0a103c9e2f13df88ca0616fbebc7"/>
+    <w:p>
+      <w:pPr>
+        <w:pStyle w:val="Heading3"/>
+      </w:pPr>
+      <w:r>
+        <w:t xml:space="preserve">2.4 Matriz de trazabilidad requisito → diagrama → elemento</w:t>
+      </w:r>
+    </w:p>
+    <w:p>
+      <w:pPr>
+        <w:pStyle w:val="FirstParagraph"/>
+      </w:pPr>
+      <w:r>
+        <w:t xml:space="preserve">La matriz completa está en</w:t>
+      </w:r>
+      <w:r>
+        <w:t xml:space="preserve"> </w:t>
+      </w:r>
+      <w:r>
+        <w:rPr>
+          <w:rStyle w:val="VerbatimChar"/>
+        </w:rPr>
+        <w:t xml:space="preserve">matriz-trazabilidad.md</w:t>
+      </w:r>
+      <w:r>
+        <w:t xml:space="preserve">. Cada</w:t>
+      </w:r>
+      <w:r>
+        <w:t xml:space="preserve"> </w:t>
+      </w:r>
+      <w:r>
+        <w:rPr>
+          <w:rStyle w:val="VerbatimChar"/>
+        </w:rPr>
+        <w:t xml:space="preserve">CU</w:t>
+      </w:r>
+      <w:r>
+        <w:t xml:space="preserve"> </w:t>
+      </w:r>
+      <w:r>
+        <w:t xml:space="preserve">se correlaciona con su nodo del diagrama de actividad y con su mensaje del diagrama de secuencia:</w:t>
+      </w:r>
+    </w:p>
+    <w:tbl>
+      <w:tblPr>
+        <w:tblStyle w:val="Table"/>
+        <w:tblW w:type="pct" w:w="5000"/>
+        <w:tblLayout w:type="fixed"/>
+        <w:tblLook w:firstRow="1" w:lastRow="0" w:firstColumn="0" w:lastColumn="0" w:noHBand="0" w:noVBand="0" w:val="0020"/>
+      </w:tblPr>
+      <w:tblGrid>
+        <w:gridCol w:w="1980"/>
+        <w:gridCol w:w="1980"/>
+        <w:gridCol w:w="1980"/>
+        <w:gridCol w:w="1980"/>
+      </w:tblGrid>
+      <w:tr>
+        <w:trPr>
+          <w:tblHeader w:val="on"/>
+        </w:trPr>
+        <w:tc>
+          <w:tcPr/>
+          <w:p>
+            <w:pPr>
+              <w:pStyle w:val="Compact"/>
+            </w:pPr>
+            <w:r>
+              <w:t xml:space="preserve">Requisito / CU</w:t>
+            </w:r>
+          </w:p>
+        </w:tc>
+        <w:tc>
+          <w:tcPr/>
+          <w:p>
+            <w:pPr>
+              <w:pStyle w:val="Compact"/>
+            </w:pPr>
+            <w:r>
+              <w:t xml:space="preserve">Diagrama de casos de uso</w:t>
+            </w:r>
+          </w:p>
+        </w:tc>
+        <w:tc>
+          <w:tcPr/>
+          <w:p>
+            <w:pPr>
+              <w:pStyle w:val="Compact"/>
+            </w:pPr>
+            <w:r>
+              <w:t xml:space="preserve">Diagrama de actividad</w:t>
+            </w:r>
+          </w:p>
+        </w:tc>
+        <w:tc>
+          <w:tcPr/>
+          <w:p>
+            <w:pPr>
+              <w:pStyle w:val="Compact"/>
+            </w:pPr>
+            <w:r>
+              <w:t xml:space="preserve">Diagrama de secuencia</w:t>
+            </w:r>
+          </w:p>
+        </w:tc>
+      </w:tr>
+      <w:tr>
+        <w:tc>
+          <w:tcPr/>
+          <w:p>
+            <w:pPr>
+              <w:pStyle w:val="Compact"/>
+            </w:pPr>
+            <w:r>
+              <w:t xml:space="preserve">CU-03 Validar</w:t>
+            </w:r>
+          </w:p>
+        </w:tc>
+        <w:tc>
+          <w:tcPr/>
+          <w:p>
+            <w:pPr>
+              <w:pStyle w:val="Compact"/>
+            </w:pPr>
+            <w:r>
+              <w:t xml:space="preserve">CU-03</w:t>
+            </w:r>
+          </w:p>
+        </w:tc>
+        <w:tc>
+          <w:tcPr/>
+          <w:p>
+            <w:pPr>
+              <w:pStyle w:val="Compact"/>
+            </w:pPr>
+            <w:r>
+              <w:t xml:space="preserve">«Registrar validación (validated_by, validated_at)»; item</w:t>
+            </w:r>
+            <w:r>
+              <w:t xml:space="preserve"> </w:t>
+            </w:r>
+            <w:r>
+              <w:rPr>
+                <w:rStyle w:val="VerbatimChar"/>
+              </w:rPr>
+              <w:t xml:space="preserve">resultado_listo</w:t>
+            </w:r>
+          </w:p>
+        </w:tc>
+        <w:tc>
+          <w:tcPr/>
+          <w:p>
+            <w:pPr>
+              <w:pStyle w:val="Compact"/>
+            </w:pPr>
+            <w:r>
+              <w:rPr>
+                <w:rStyle w:val="VerbatimChar"/>
+              </w:rPr>
+              <w:t xml:space="preserve">POST …/validate</w:t>
+            </w:r>
+          </w:p>
+        </w:tc>
+      </w:tr>
+      <w:tr>
+        <w:tc>
+          <w:tcPr/>
+          <w:p>
+            <w:pPr>
+              <w:pStyle w:val="Compact"/>
+            </w:pPr>
+            <w:r>
+              <w:t xml:space="preserve">CU-04 Rechazar con motivo</w:t>
+            </w:r>
+          </w:p>
+        </w:tc>
+        <w:tc>
+          <w:tcPr/>
+          <w:p>
+            <w:pPr>
+              <w:pStyle w:val="Compact"/>
+            </w:pPr>
+            <w:r>
+              <w:t xml:space="preserve">CU-04</w:t>
+            </w:r>
+            <w:r>
+              <w:t xml:space="preserve"> </w:t>
+            </w:r>
+            <w:r>
+              <w:rPr>
+                <w:rStyle w:val="VerbatimChar"/>
+              </w:rPr>
+              <w:t xml:space="preserve">include</w:t>
+            </w:r>
+            <w:r>
+              <w:t xml:space="preserve"> </w:t>
+            </w:r>
+            <w:r>
+              <w:t xml:space="preserve">CU-02</w:t>
+            </w:r>
+          </w:p>
+        </w:tc>
+        <w:tc>
+          <w:tcPr/>
+          <w:p>
+            <w:pPr>
+              <w:pStyle w:val="Compact"/>
+            </w:pPr>
+            <w:r>
+              <w:t xml:space="preserve">decisión «¿Motivo proporcionado?»; excepción motivo obligatorio</w:t>
+            </w:r>
+          </w:p>
+        </w:tc>
+        <w:tc>
+          <w:tcPr/>
+          <w:p>
+            <w:pPr>
+              <w:pStyle w:val="Compact"/>
+            </w:pPr>
+            <w:r>
+              <w:rPr>
+                <w:rStyle w:val="VerbatimChar"/>
+              </w:rPr>
+              <w:t xml:space="preserve">POST …/reject</w:t>
+            </w:r>
+            <w:r>
+              <w:t xml:space="preserve">;</w:t>
+            </w:r>
+            <w:r>
+              <w:t xml:space="preserve"> </w:t>
+            </w:r>
+            <w:r>
+              <w:rPr>
+                <w:rStyle w:val="VerbatimChar"/>
+              </w:rPr>
+              <w:t xml:space="preserve">422</w:t>
+            </w:r>
+          </w:p>
+        </w:tc>
+      </w:tr>
+      <w:tr>
+        <w:tc>
+          <w:tcPr/>
+          <w:p>
+            <w:pPr>
+              <w:pStyle w:val="Compact"/>
+            </w:pPr>
+            <w:r>
+              <w:t xml:space="preserve">CU-05 Valor crítico</w:t>
+            </w:r>
+          </w:p>
+        </w:tc>
+        <w:tc>
+          <w:tcPr/>
+          <w:p>
+            <w:pPr>
+              <w:pStyle w:val="Compact"/>
+            </w:pPr>
+            <w:r>
+              <w:t xml:space="preserve">CU-05</w:t>
+            </w:r>
+            <w:r>
+              <w:t xml:space="preserve"> </w:t>
+            </w:r>
+            <w:r>
+              <w:rPr>
+                <w:rStyle w:val="VerbatimChar"/>
+              </w:rPr>
+              <w:t xml:space="preserve">extend</w:t>
+            </w:r>
+            <w:r>
+              <w:t xml:space="preserve"> </w:t>
+            </w:r>
+            <w:r>
+              <w:t xml:space="preserve">CU-03</w:t>
+            </w:r>
+          </w:p>
+        </w:tc>
+        <w:tc>
+          <w:tcPr/>
+          <w:p>
+            <w:pPr>
+              <w:pStyle w:val="Compact"/>
+            </w:pPr>
+            <w:r>
+              <w:t xml:space="preserve">decisión umbral crítico; nota de escalamiento</w:t>
+            </w:r>
+          </w:p>
+        </w:tc>
+        <w:tc>
+          <w:tcPr/>
+          <w:p>
+            <w:pPr>
+              <w:pStyle w:val="Compact"/>
+            </w:pPr>
+            <w:r>
+              <w:rPr>
+                <w:rStyle w:val="VerbatimChar"/>
+              </w:rPr>
+              <w:t xml:space="preserve">CriticalAlert</w:t>
+            </w:r>
+            <w:r>
+              <w:t xml:space="preserve">; notifica al médico</w:t>
+            </w:r>
+          </w:p>
+        </w:tc>
+      </w:tr>
+      <w:tr>
+        <w:tc>
+          <w:tcPr/>
+          <w:p>
+            <w:pPr>
+              <w:pStyle w:val="Compact"/>
+            </w:pPr>
+            <w:r>
+              <w:t xml:space="preserve">CU-07/CU-08 Corrección</w:t>
+            </w:r>
+          </w:p>
+        </w:tc>
+        <w:tc>
+          <w:tcPr/>
+          <w:p>
+            <w:pPr>
+              <w:pStyle w:val="Compact"/>
+            </w:pPr>
+            <w:r>
+              <w:t xml:space="preserve">CU-07/CU-08</w:t>
+            </w:r>
+          </w:p>
+        </w:tc>
+        <w:tc>
+          <w:tcPr/>
+          <w:p>
+            <w:pPr>
+              <w:pStyle w:val="Compact"/>
+            </w:pPr>
+            <w:r>
+              <w:t xml:space="preserve">partición Técnico; bucle</w:t>
+            </w:r>
+            <w:r>
+              <w:t xml:space="preserve"> </w:t>
+            </w:r>
+            <w:r>
+              <w:rPr>
+                <w:rStyle w:val="VerbatimChar"/>
+              </w:rPr>
+              <w:t xml:space="preserve">repeat while</w:t>
+            </w:r>
+          </w:p>
+        </w:tc>
+        <w:tc>
+          <w:tcPr/>
+          <w:p>
+            <w:pPr>
+              <w:pStyle w:val="Compact"/>
+            </w:pPr>
+            <w:r>
+              <w:rPr>
+                <w:rStyle w:val="VerbatimChar"/>
+              </w:rPr>
+              <w:t xml:space="preserve">POST …/correct</w:t>
+            </w:r>
+            <w:r>
+              <w:t xml:space="preserve">;</w:t>
+            </w:r>
+            <w:r>
+              <w:t xml:space="preserve"> </w:t>
+            </w:r>
+            <w:r>
+              <w:rPr>
+                <w:rStyle w:val="VerbatimChar"/>
+              </w:rPr>
+              <w:t xml:space="preserve">POST …/validate</w:t>
+            </w:r>
+          </w:p>
+        </w:tc>
+      </w:tr>
+    </w:tbl>
+    <w:p>
+      <w:pPr>
+        <w:pStyle w:val="BodyText"/>
+      </w:pPr>
+      <w:r>
+        <w:t xml:space="preserve">De este modo, los tres diagramas quedan</w:t>
+      </w:r>
+      <w:r>
+        <w:t xml:space="preserve"> </w:t>
+      </w:r>
+      <w:r>
+        <w:rPr>
+          <w:b/>
+          <w:bCs/>
+        </w:rPr>
+        <w:t xml:space="preserve">trazables, coherentes y reproducibles</w:t>
+      </w:r>
+      <w:r>
+        <w:t xml:space="preserve"> </w:t>
+      </w:r>
+      <w:r>
+        <w:t xml:space="preserve">desde sus fuentes</w:t>
+      </w:r>
+      <w:r>
+        <w:t xml:space="preserve"> </w:t>
+      </w:r>
+      <w:r>
+        <w:rPr>
+          <w:rStyle w:val="VerbatimChar"/>
+        </w:rPr>
+        <w:t xml:space="preserve">.puml</w:t>
+      </w:r>
+      <w:r>
+        <w:t xml:space="preserve">.</w:t>
+      </w:r>
+    </w:p>
+    <w:p>
+      <w:r>
+        <w:pict>
+          <v:rect style="width:0;height:1.5pt" o:hralign="center" o:hrstd="t" o:hr="t"/>
+        </w:pict>
+      </w:r>
+    </w:p>
+    <w:bookmarkEnd w:id="25"/>
+    <w:bookmarkEnd w:id="26"/>
+    <w:bookmarkStart w:id="27" w:name="conclusión"/>
+    <w:p>
+      <w:pPr>
+        <w:pStyle w:val="Heading2"/>
+      </w:pPr>
+      <w:r>
+        <w:t xml:space="preserve">3. Conclusión</w:t>
+      </w:r>
+    </w:p>
+    <w:p>
+      <w:pPr>
+        <w:pStyle w:val="FirstParagraph"/>
+      </w:pPr>
+      <w:r>
+        <w:t xml:space="preserve">Se logró un modelado completo y trazable del proceso de validación de resultados por bioquímico. El diagrama de casos de uso delimita actores y objetivos (CU-01 a CU-08); el de actividad expresa decisiones, excepciones y reglas de negocio con swimlanes; y el de secuencia describe participantes, mensajes HTTP y validaciones con sus respuestas. Los tres comparten el mismo modelo de actores y estados, por lo que se cumplen los requisitos del enunciado.</w:t>
+      </w:r>
+    </w:p>
+    <w:p>
+      <w:pPr>
+        <w:pStyle w:val="BodyText"/>
+      </w:pPr>
+      <w:r>
+        <w:t xml:space="preserve">La decisión</w:t>
+      </w:r>
+      <w:r>
+        <w:t xml:space="preserve"> </w:t>
+      </w:r>
+      <w:r>
+        <w:rPr>
+          <w:b/>
+          <w:bCs/>
+        </w:rPr>
+        <w:t xml:space="preserve">más relevante</w:t>
+      </w:r>
+      <w:r>
+        <w:t xml:space="preserve"> </w:t>
+      </w:r>
+      <w:r>
+        <w:t xml:space="preserve">fue la regla de negocio de que un</w:t>
+      </w:r>
+      <w:r>
+        <w:t xml:space="preserve"> </w:t>
+      </w:r>
+      <w:r>
+        <w:rPr>
+          <w:b/>
+          <w:bCs/>
+        </w:rPr>
+        <w:t xml:space="preserve">valor crítico no puede rechazarse directamente</w:t>
+      </w:r>
+      <w:r>
+        <w:t xml:space="preserve"> </w:t>
+      </w:r>
+      <w:r>
+        <w:t xml:space="preserve">y debe escalarse: conduce el</w:t>
+      </w:r>
+      <w:r>
+        <w:t xml:space="preserve"> </w:t>
+      </w:r>
+      <w:r>
+        <w:rPr>
+          <w:rStyle w:val="VerbatimChar"/>
+        </w:rPr>
         <w:t xml:space="preserve">extend</w:t>
       </w:r>
       <w:r>
         <w:t xml:space="preserve"> </w:t>
       </w:r>
       <w:r>
-        <w:t xml:space="preserve">entre CU-05 y CU-03, define la correspondiente divergencia en el diagrama de actividad y se refleja en la secuencia con la creación de</w:t>
+        <w:t xml:space="preserve">de CU-05 sobre CU-03, define la divergencia correspondiente en el diagrama de actividad y se refleja en la secuencia mediante la creación de</w:t>
       </w:r>
       <w:r>
         <w:t xml:space="preserve"> </w:t>
@@ -891,7 +2747,7 @@
         <w:t xml:space="preserve"> </w:t>
       </w:r>
       <w:r>
-        <w:t xml:space="preserve">y la notificación al médico. Fue la decisión que mayor impacto tuvo en la coherencia entre los tres artefactos.</w:t>
+        <w:t xml:space="preserve">y la notificación al médico. Es la decisión que más influyó en la coherencia entre los tres artefactos.</w:t>
       </w:r>
     </w:p>
     <w:p>
@@ -899,7 +2755,23 @@
         <w:pStyle w:val="BodyText"/>
       </w:pPr>
       <w:r>
-        <w:t xml:space="preserve">La principal limitación que permanece es que el modelo conceptual no incluye consideraciones de concurrencia ni de auditoría de movimientos, que quedan fuera del alcance de la semana y corresponden a otros módulos del sistema.</w:t>
+        <w:t xml:space="preserve">La principal</w:t>
+      </w:r>
+      <w:r>
+        <w:t xml:space="preserve"> </w:t>
+      </w:r>
+      <w:r>
+        <w:rPr>
+          <w:b/>
+          <w:bCs/>
+        </w:rPr>
+        <w:t xml:space="preserve">limitación</w:t>
+      </w:r>
+      <w:r>
+        <w:t xml:space="preserve"> </w:t>
+      </w:r>
+      <w:r>
+        <w:t xml:space="preserve">es que el modelo conceptual no cubre concurrencia ni auditoría de movimientos —fuera del alcance de la semana y pertenecientes a otros módulos del sistema.</w:t>
       </w:r>
     </w:p>
     <w:p>
@@ -907,10 +2779,23 @@
         <w:pStyle w:val="BodyText"/>
       </w:pPr>
       <w:r>
-        <w:t xml:space="preserve">La evidencia del cumplimiento se respalda en: las fuentes editables</w:t>
-      </w:r>
-      <w:r>
-        <w:t xml:space="preserve"> </w:t>
+        <w:t xml:space="preserve">La</w:t>
+      </w:r>
+      <w:r>
+        <w:t xml:space="preserve"> </w:t>
+      </w:r>
+      <w:r>
+        <w:rPr>
+          <w:b/>
+          <w:bCs/>
+        </w:rPr>
+        <w:t xml:space="preserve">evidencia del cumplimiento</w:t>
+      </w:r>
+      <w:r>
+        <w:t xml:space="preserve"> </w:t>
+      </w:r>
+      <w:r>
+        <w:t xml:space="preserve">reposa en: las fuentes editables (</w:t>
       </w:r>
       <w:r>
         <w:rPr>
@@ -919,14 +2804,42 @@
         <w:t xml:space="preserve">.puml</w:t>
       </w:r>
       <w:r>
-        <w:t xml:space="preserve"> </w:t>
-      </w:r>
-      <w:r>
-        <w:t xml:space="preserve">que permiten reproducir cada diagrama, la matriz de trazabilidad requisito → diagrama → elemento, el historial Git ordenado por propósitos y el repositorio compartido con el docente. La defensa oral permitirá justificar estas decisiones y demostrar la comprensión del proceso.</w:t>
-      </w:r>
-    </w:p>
-    <w:bookmarkEnd w:id="31"/>
-    <w:bookmarkStart w:id="32" w:name="bibliografía"/>
+        <w:t xml:space="preserve">) que reproducen cada diagrama, la matriz de trazabilidad, el historial Git (commits con propósito,</w:t>
+      </w:r>
+      <w:r>
+        <w:t xml:space="preserve"> </w:t>
+      </w:r>
+      <w:r>
+        <w:rPr>
+          <w:rStyle w:val="VerbatimChar"/>
+        </w:rPr>
+        <w:t xml:space="preserve">git log --oneline</w:t>
+      </w:r>
+      <w:r>
+        <w:t xml:space="preserve">) y el repositorio compartido con el docente, etiquetado como</w:t>
+      </w:r>
+      <w:r>
+        <w:t xml:space="preserve"> </w:t>
+      </w:r>
+      <w:r>
+        <w:rPr>
+          <w:rStyle w:val="VerbatimChar"/>
+        </w:rPr>
+        <w:t xml:space="preserve">tarea-1-entrega</w:t>
+      </w:r>
+      <w:r>
+        <w:t xml:space="preserve">. La defensa oral permitirá justificar estas decisiones.</w:t>
+      </w:r>
+    </w:p>
+    <w:p>
+      <w:r>
+        <w:pict>
+          <v:rect style="width:0;height:1.5pt" o:hralign="center" o:hrstd="t" o:hr="t"/>
+        </w:pict>
+      </w:r>
+    </w:p>
+    <w:bookmarkEnd w:id="27"/>
+    <w:bookmarkStart w:id="28" w:name="bibliografía"/>
     <w:p>
       <w:pPr>
         <w:pStyle w:val="Heading2"/>
@@ -940,7 +2853,7 @@
         <w:pStyle w:val="Compact"/>
         <w:numPr>
           <w:ilvl w:val="0"/>
-          <w:numId w:val="1002"/>
+          <w:numId w:val="1003"/>
         </w:numPr>
       </w:pPr>
       <w:r>
@@ -957,7 +2870,7 @@
         <w:t xml:space="preserve">Unified Modeling Language (UML), versión 2.5.1</w:t>
       </w:r>
       <w:r>
-        <w:t xml:space="preserve">.</w:t>
+        <w:t xml:space="preserve">. Specification formal/2017-12-05.</w:t>
       </w:r>
     </w:p>
     <w:p>
@@ -965,31 +2878,15 @@
         <w:pStyle w:val="Compact"/>
         <w:numPr>
           <w:ilvl w:val="0"/>
-          <w:numId w:val="1002"/>
+          <w:numId w:val="1003"/>
         </w:numPr>
       </w:pPr>
       <w:r>
-        <w:t xml:space="preserve">Documentación oficial de PHP.</w:t>
-      </w:r>
-      <w:r>
-        <w:t xml:space="preserve"> </w:t>
-      </w:r>
-      <w:r>
-        <w:rPr>
-          <w:i/>
-          <w:iCs/>
-        </w:rPr>
-        <w:t xml:space="preserve">Supported Versions</w:t>
-      </w:r>
-      <w:r>
-        <w:t xml:space="preserve"> </w:t>
-      </w:r>
-      <w:r>
-        <w:t xml:space="preserve">y manual de PDO. https://www.php.net/docs.php (cuando corresponda).</w:t>
-      </w:r>
-    </w:p>
-    <w:bookmarkEnd w:id="32"/>
-    <w:bookmarkEnd w:id="33"/>
+        <w:t xml:space="preserve">Documentación oficial de PHP. «Supported Versions» y manual de PDO. https://www.php.net/docs.php (cuando corresponda).</w:t>
+      </w:r>
+    </w:p>
+    <w:bookmarkEnd w:id="28"/>
+    <w:bookmarkEnd w:id="29"/>
     <w:sectPr>
       <w:footnotePr>
         <w:numRestart w:val="eachSect"/>
@@ -1322,6 +3219,9 @@
     </w:lvlOverride>
   </w:num>
   <w:num w:numId="1002">
+    <w:abstractNumId w:val="991"/>
+  </w:num>
+  <w:num w:numId="1003">
     <w:abstractNumId w:val="991"/>
   </w:num>
 </w:numbering>

</xml_diff>